<commit_message>
auto(daily): dev loop report 2026-06-20
</commit_message>
<xml_diff>
--- a/reports/hypothesis/2026-06-20.docx
+++ b/reports/hypothesis/2026-06-20.docx
@@ -15,7 +15,7 @@
         <w:rPr>
           <w:i/>
         </w:rPr>
-        <w:t>생성일: 2026-06-20 09:15 KST  |  표본: 측정소당 최소 2628건 / 총 13315건</w:t>
+        <w:t>생성일: 2026-06-20 13:39 KST  |  표본: 측정소당 최소 2633건 / 총 13340건</w:t>
       </w:r>
     </w:p>
     <w:p>
@@ -143,7 +143,7 @@
           </w:tcPr>
           <w:p>
             <w:r>
-              <w:t>35.942</w:t>
+              <w:t>35.887</w:t>
             </w:r>
           </w:p>
         </w:tc>
@@ -153,7 +153,7 @@
           </w:tcPr>
           <w:p>
             <w:r>
-              <w:t>33.026</w:t>
+              <w:t>32.977</w:t>
             </w:r>
           </w:p>
         </w:tc>
@@ -163,7 +163,7 @@
           </w:tcPr>
           <w:p>
             <w:r>
-              <w:t>+2.917</w:t>
+              <w:t>+2.911</w:t>
             </w:r>
           </w:p>
         </w:tc>
@@ -215,7 +215,7 @@
           </w:tcPr>
           <w:p>
             <w:r>
-              <w:t>20.257</w:t>
+              <w:t>20.227</w:t>
             </w:r>
           </w:p>
         </w:tc>
@@ -225,7 +225,7 @@
           </w:tcPr>
           <w:p>
             <w:r>
-              <w:t>17.506</w:t>
+              <w:t>17.479</w:t>
             </w:r>
           </w:p>
         </w:tc>
@@ -235,7 +235,7 @@
           </w:tcPr>
           <w:p>
             <w:r>
-              <w:t>+2.750</w:t>
+              <w:t>+2.748</w:t>
             </w:r>
           </w:p>
         </w:tc>
@@ -660,7 +660,7 @@
           </w:tcPr>
           <w:p>
             <w:r>
-              <w:t>31.37</w:t>
+              <w:t>31.25</w:t>
             </w:r>
           </w:p>
         </w:tc>
@@ -722,7 +722,7 @@
           </w:tcPr>
           <w:p>
             <w:r>
-              <w:t>83.62</w:t>
+              <w:t>83.33</w:t>
             </w:r>
           </w:p>
         </w:tc>
@@ -784,7 +784,7 @@
           </w:tcPr>
           <w:p>
             <w:r>
-              <w:t>14.44</w:t>
+              <w:t>14.46</w:t>
             </w:r>
           </w:p>
         </w:tc>
@@ -846,7 +846,7 @@
           </w:tcPr>
           <w:p>
             <w:r>
-              <w:t>164.53</w:t>
+              <w:t>164.31</w:t>
             </w:r>
           </w:p>
         </w:tc>
@@ -876,7 +876,7 @@
           </w:tcPr>
           <w:p>
             <w:r>
-              <w:t>0.049</w:t>
+              <w:t>0.048</w:t>
             </w:r>
           </w:p>
         </w:tc>
@@ -908,7 +908,7 @@
           </w:tcPr>
           <w:p>
             <w:r>
-              <w:t>67.92</w:t>
+              <w:t>68.54</w:t>
             </w:r>
           </w:p>
         </w:tc>
@@ -970,7 +970,7 @@
           </w:tcPr>
           <w:p>
             <w:r>
-              <w:t>162.75</w:t>
+              <w:t>163.84</w:t>
             </w:r>
           </w:p>
         </w:tc>

</xml_diff>